<commit_message>
feat: add map_assistant_v1 project with .gitignore
- Add comprehensive .gitignore (exclude node_modules, __pycache__, logs, build artifacts, large data files)
- Remove tracked cache/build/log files from git index
- Include backend agents, tools, config, and frontend source code
- Include documentation and deployment configs
</commit_message>
<xml_diff>
--- a/map_assistant_v1/backend/templates/report_template.docx
+++ b/map_assistant_v1/backend/templates/report_template.docx
@@ -4,64 +4,152 @@
   <w:body>
     <w:p>
       <w:pPr>
-        <w:pStyle w:val="Title"/>
+        <w:jc w:val="center"/>
       </w:pPr>
       <w:r>
+        <w:rPr>
+          <w:rFonts w:ascii="黑体" w:hAnsi="黑体" w:eastAsia="黑体"/>
+          <w:b/>
+          <w:color w:val="1F497D"/>
+          <w:sz w:val="36"/>
+        </w:rPr>
         <w:t>{{report_title}}</w:t>
+      </w:r>
+    </w:p>
+    <w:p/>
+    <w:p>
+      <w:pPr>
+        <w:jc w:val="right"/>
+      </w:pPr>
+      <w:r>
+        <w:rPr>
+          <w:rFonts w:ascii="宋体" w:hAnsi="宋体" w:eastAsia="宋体"/>
+          <w:b w:val="0"/>
+          <w:color w:val="808080"/>
+          <w:sz w:val="21"/>
+        </w:rPr>
+        <w:t>生成时间：{{generated_date}}</w:t>
       </w:r>
     </w:p>
     <w:p>
       <w:pPr>
-        <w:pStyle w:val="Heading1"/>
+        <w:jc w:val="center"/>
       </w:pPr>
       <w:r>
+        <w:rPr>
+          <w:rFonts w:ascii="宋体" w:hAnsi="宋体" w:eastAsia="宋体"/>
+          <w:b w:val="0"/>
+          <w:color w:val="B4B4B4"/>
+          <w:sz w:val="20"/>
+        </w:rPr>
+        <w:t>──────────────────────────────────────────</w:t>
+      </w:r>
+    </w:p>
+    <w:p/>
+    <w:p>
+      <w:r>
+        <w:rPr>
+          <w:rFonts w:ascii="黑体" w:hAnsi="黑体" w:eastAsia="黑体"/>
+          <w:b/>
+          <w:color w:val="1F497D"/>
+          <w:sz w:val="28"/>
+        </w:rPr>
         <w:t>1. 概述</w:t>
       </w:r>
     </w:p>
     <w:p>
+      <w:pPr>
+        <w:spacing w:after="120"/>
+        <w:ind w:firstLine="480"/>
+      </w:pPr>
       <w:r>
+        <w:rPr>
+          <w:rFonts w:ascii="宋体" w:hAnsi="宋体" w:eastAsia="宋体"/>
+          <w:b w:val="0"/>
+          <w:sz w:val="24"/>
+        </w:rPr>
         <w:t>{{summary}}</w:t>
       </w:r>
     </w:p>
+    <w:p/>
     <w:p>
-      <w:pPr>
-        <w:pStyle w:val="Heading1"/>
-      </w:pPr>
       <w:r>
+        <w:rPr>
+          <w:rFonts w:ascii="黑体" w:hAnsi="黑体" w:eastAsia="黑体"/>
+          <w:b/>
+          <w:color w:val="1F497D"/>
+          <w:sz w:val="28"/>
+        </w:rPr>
         <w:t>2. 详细数据</w:t>
       </w:r>
     </w:p>
     <w:p>
       <w:r>
+        <w:rPr>
+          <w:rFonts w:ascii="宋体" w:hAnsi="宋体" w:eastAsia="宋体"/>
+          <w:b w:val="0"/>
+          <w:color w:val="505050"/>
+          <w:sz w:val="24"/>
+        </w:rPr>
         <w:t>根据您的查询，以下是相关数据分析：</w:t>
       </w:r>
     </w:p>
     <w:p>
+      <w:pPr>
+        <w:spacing w:after="120"/>
+        <w:ind w:firstLine="480"/>
+      </w:pPr>
       <w:r>
+        <w:rPr>
+          <w:rFonts w:ascii="宋体" w:hAnsi="宋体" w:eastAsia="宋体"/>
+          <w:b w:val="0"/>
+          <w:sz w:val="24"/>
+        </w:rPr>
         <w:t>{{details}}</w:t>
+      </w:r>
+    </w:p>
+    <w:p/>
+    <w:p>
+      <w:r>
+        <w:rPr>
+          <w:rFonts w:ascii="黑体" w:hAnsi="黑体" w:eastAsia="黑体"/>
+          <w:b/>
+          <w:color w:val="1F497D"/>
+          <w:sz w:val="28"/>
+        </w:rPr>
+        <w:t>3. 结论与建议</w:t>
+      </w:r>
+    </w:p>
+    <w:p>
+      <w:r/>
+      <w:r>
+        <w:t>{{knowledge_content}}</w:t>
+      </w:r>
+    </w:p>
+    <w:p>
+      <w:r/>
+      <w:r>
+        <w:t>三、政策依据与参考资料</w:t>
       </w:r>
     </w:p>
     <w:p>
       <w:pPr>
-        <w:pStyle w:val="Heading1"/>
+        <w:spacing w:after="120"/>
+        <w:ind w:firstLine="480"/>
       </w:pPr>
       <w:r>
-        <w:t>3. 结论</w:t>
-      </w:r>
-    </w:p>
-    <w:p>
-      <w:r>
+        <w:rPr>
+          <w:rFonts w:ascii="宋体" w:hAnsi="宋体" w:eastAsia="宋体"/>
+          <w:b w:val="0"/>
+          <w:sz w:val="24"/>
+        </w:rPr>
         <w:t>{{conclusion}}</w:t>
       </w:r>
     </w:p>
-    <w:p>
-      <w:r>
-        <w:t>生成时间: {{generated_date}}</w:t>
-      </w:r>
-    </w:p>
+    <w:p/>
     <w:sectPr>
-      <w:pgSz w:w="12240" w:h="15840"/>
-      <w:pgMar w:top="1440" w:right="1800" w:bottom="1440" w:left="1800" w:header="720" w:footer="720" w:gutter="0"/>
+      <w:pgSz w:w="11906" w:h="16838"/>
+      <w:pgMar w:top="1440" w:right="1797" w:bottom="1440" w:left="1797" w:header="720" w:footer="720" w:gutter="0"/>
       <w:cols w:space="720"/>
       <w:docGrid w:linePitch="360"/>
     </w:sectPr>

</xml_diff>